<commit_message>
Updated repo with code from Shauna
</commit_message>
<xml_diff>
--- a/Resources/Current Work/SoftwareRequirementsDocument.docx
+++ b/Resources/Current Work/SoftwareRequirementsDocument.docx
@@ -1,6 +1,6 @@
 
 <file path=word/document.xml><?xml version="1.0" encoding="utf-8"?>
-<w:document xmlns:wpc="http://schemas.microsoft.com/office/word/2010/wordprocessingCanvas" xmlns:cx="http://schemas.microsoft.com/office/drawing/2014/chartex" xmlns:cx1="http://schemas.microsoft.com/office/drawing/2015/9/8/chartex" xmlns:cx2="http://schemas.microsoft.com/office/drawing/2015/10/21/chartex" xmlns:cx3="http://schemas.microsoft.com/office/drawing/2016/5/9/chartex" xmlns:cx4="http://schemas.microsoft.com/office/drawing/2016/5/10/chartex" xmlns:cx5="http://schemas.microsoft.com/office/drawing/2016/5/11/chartex" xmlns:cx6="http://schemas.microsoft.com/office/drawing/2016/5/12/chartex" xmlns:cx7="http://schemas.microsoft.com/office/drawing/2016/5/13/chartex" xmlns:cx8="http://schemas.microsoft.com/office/drawing/2016/5/14/chartex" xmlns:mc="http://schemas.openxmlformats.org/markup-compatibility/2006" xmlns:aink="http://schemas.microsoft.com/office/drawing/2016/ink" xmlns:am3d="http://schemas.microsoft.com/office/drawing/2017/model3d" xmlns:o="urn:schemas-microsoft-com:office:office" xmlns:oel="http://schemas.microsoft.com/office/2019/extlst" xmlns:r="http://schemas.openxmlformats.org/officeDocument/2006/relationships" xmlns:m="http://schemas.openxmlformats.org/officeDocument/2006/math" xmlns:v="urn:schemas-microsoft-com:vml" xmlns:wp14="http://schemas.microsoft.com/office/word/2010/wordprocessingDrawing" xmlns:wp="http://schemas.openxmlformats.org/drawingml/2006/wordprocessingDrawing" xmlns:w10="urn:schemas-microsoft-com:office:word" xmlns:w="http://schemas.openxmlformats.org/wordprocessingml/2006/main" xmlns:w14="http://schemas.microsoft.com/office/word/2010/wordml" xmlns:w15="http://schemas.microsoft.com/office/word/2012/wordml" xmlns:w16cex="http://schemas.microsoft.com/office/word/2018/wordml/cex" xmlns:w16cid="http://schemas.microsoft.com/office/word/2016/wordml/cid" xmlns:w16="http://schemas.microsoft.com/office/word/2018/wordml" xmlns:w16du="http://schemas.microsoft.com/office/word/2023/wordml/word16du" xmlns:w16sdtdh="http://schemas.microsoft.com/office/word/2020/wordml/sdtdatahash" xmlns:w16se="http://schemas.microsoft.com/office/word/2015/wordml/symex" xmlns:wpg="http://schemas.microsoft.com/office/word/2010/wordprocessingGroup" xmlns:wpi="http://schemas.microsoft.com/office/word/2010/wordprocessingInk" xmlns:wne="http://schemas.microsoft.com/office/word/2006/wordml" xmlns:wps="http://schemas.microsoft.com/office/word/2010/wordprocessingShape" mc:Ignorable="w14 w15 w16se w16cid w16 w16cex w16sdtdh w16du wp14">
+<w:document xmlns:wpc="http://schemas.microsoft.com/office/word/2010/wordprocessingCanvas" xmlns:cx="http://schemas.microsoft.com/office/drawing/2014/chartex" xmlns:cx1="http://schemas.microsoft.com/office/drawing/2015/9/8/chartex" xmlns:cx2="http://schemas.microsoft.com/office/drawing/2015/10/21/chartex" xmlns:cx3="http://schemas.microsoft.com/office/drawing/2016/5/9/chartex" xmlns:cx4="http://schemas.microsoft.com/office/drawing/2016/5/10/chartex" xmlns:cx5="http://schemas.microsoft.com/office/drawing/2016/5/11/chartex" xmlns:cx6="http://schemas.microsoft.com/office/drawing/2016/5/12/chartex" xmlns:cx7="http://schemas.microsoft.com/office/drawing/2016/5/13/chartex" xmlns:cx8="http://schemas.microsoft.com/office/drawing/2016/5/14/chartex" xmlns:mc="http://schemas.openxmlformats.org/markup-compatibility/2006" xmlns:aink="http://schemas.microsoft.com/office/drawing/2016/ink" xmlns:am3d="http://schemas.microsoft.com/office/drawing/2017/model3d" xmlns:o="urn:schemas-microsoft-com:office:office" xmlns:oel="http://schemas.microsoft.com/office/2019/extlst" xmlns:r="http://schemas.openxmlformats.org/officeDocument/2006/relationships" xmlns:m="http://schemas.openxmlformats.org/officeDocument/2006/math" xmlns:v="urn:schemas-microsoft-com:vml" xmlns:wp14="http://schemas.microsoft.com/office/word/2010/wordprocessingDrawing" xmlns:wp="http://schemas.openxmlformats.org/drawingml/2006/wordprocessingDrawing" xmlns:w10="urn:schemas-microsoft-com:office:word" xmlns:w="http://schemas.openxmlformats.org/wordprocessingml/2006/main" xmlns:w14="http://schemas.microsoft.com/office/word/2010/wordml" xmlns:w15="http://schemas.microsoft.com/office/word/2012/wordml" xmlns:w16cex="http://schemas.microsoft.com/office/word/2018/wordml/cex" xmlns:w16cid="http://schemas.microsoft.com/office/word/2016/wordml/cid" xmlns:w16="http://schemas.microsoft.com/office/word/2018/wordml" xmlns:w16sdtdh="http://schemas.microsoft.com/office/word/2020/wordml/sdtdatahash" xmlns:w16se="http://schemas.microsoft.com/office/word/2015/wordml/symex" xmlns:wpg="http://schemas.microsoft.com/office/word/2010/wordprocessingGroup" xmlns:wpi="http://schemas.microsoft.com/office/word/2010/wordprocessingInk" xmlns:wne="http://schemas.microsoft.com/office/word/2006/wordml" xmlns:wps="http://schemas.microsoft.com/office/word/2010/wordprocessingShape" mc:Ignorable="w14 w15 w16se w16cid w16 w16cex w16sdtdh wp14">
   <w:body>
     <w:p>
       <w:pPr>
@@ -1828,7 +1828,6 @@
           <w:docPartUnique/>
         </w:docPartObj>
       </w:sdtPr>
-      <w:sdtEndPr/>
       <w:sdtContent>
         <w:p>
           <w:pPr>
@@ -7965,6 +7964,7 @@
               <w:rPr>
                 <w:color w:val="00B0F0"/>
               </w:rPr>
+              <w:lastRenderedPageBreak/>
               <w:t>API</w:t>
             </w:r>
           </w:p>
@@ -8655,6 +8655,7 @@
         <w:rPr>
           <w:color w:val="00B0F0"/>
         </w:rPr>
+        <w:lastRenderedPageBreak/>
         <w:t xml:space="preserve"> </w:t>
       </w:r>
     </w:p>
@@ -9057,6 +9058,7 @@
           <w:color w:val="00B0F0"/>
           <w:lang w:val="en-US"/>
         </w:rPr>
+        <w:lastRenderedPageBreak/>
         <w:t>7. Offline Functionality: Providing offline functionality where possible to allow users to access certain features or content even when they're not connected to the internet.</w:t>
       </w:r>
     </w:p>
@@ -9152,6 +9154,7 @@
       </w:pPr>
       <w:bookmarkStart w:id="8" w:name="_Toc156255128"/>
       <w:r>
+        <w:lastRenderedPageBreak/>
         <w:t>General Description</w:t>
       </w:r>
       <w:bookmarkEnd w:id="8"/>
@@ -9598,6 +9601,7 @@
           <w:color w:val="00B0F0"/>
           <w:lang w:val="en-US"/>
         </w:rPr>
+        <w:lastRenderedPageBreak/>
         <w:t xml:space="preserve">   - Emerging artists are aspiring musicians who use the platform to showcase their music, gain exposure, and connect with fans.</w:t>
       </w:r>
     </w:p>
@@ -9918,6 +9922,7 @@
           <w:color w:val="00B0F0"/>
           <w:lang w:val="en-US"/>
         </w:rPr>
+        <w:lastRenderedPageBreak/>
         <w:t xml:space="preserve">The software will be dependent on Spring Web and </w:t>
       </w:r>
       <w:proofErr w:type="spellStart"/>
@@ -10434,6 +10439,7 @@
       </w:pPr>
       <w:bookmarkStart w:id="17" w:name="_Toc156255137"/>
       <w:r>
+        <w:lastRenderedPageBreak/>
         <w:t>Use-Case Model</w:t>
       </w:r>
       <w:bookmarkEnd w:id="17"/>
@@ -10461,10 +10467,10 @@
           <w:noProof/>
         </w:rPr>
         <w:drawing>
-          <wp:inline distT="0" distB="0" distL="0" distR="0" wp14:anchorId="7535F347" wp14:editId="208D870A">
-            <wp:extent cx="6645910" cy="7286625"/>
-            <wp:effectExtent l="0" t="0" r="2540" b="9525"/>
-            <wp:docPr id="692218620" name="Picture 5" descr="A diagram of people and text&#10;&#10;Description automatically generated with medium confidence"/>
+          <wp:inline distT="0" distB="0" distL="0" distR="0" wp14:anchorId="2FBCA69D" wp14:editId="788EEB8E">
+            <wp:extent cx="6007728" cy="6586917"/>
+            <wp:effectExtent l="0" t="0" r="0" b="4445"/>
+            <wp:docPr id="40279500" name="Picture 1" descr="A diagram of people with text&#10;&#10;Description automatically generated with medium confidence"/>
             <wp:cNvGraphicFramePr>
               <a:graphicFrameLocks xmlns:a="http://schemas.openxmlformats.org/drawingml/2006/main" noChangeAspect="1"/>
             </wp:cNvGraphicFramePr>
@@ -10472,7 +10478,7 @@
               <a:graphicData uri="http://schemas.openxmlformats.org/drawingml/2006/picture">
                 <pic:pic xmlns:pic="http://schemas.openxmlformats.org/drawingml/2006/picture">
                   <pic:nvPicPr>
-                    <pic:cNvPr id="692218620" name="Picture 5" descr="A diagram of people and text&#10;&#10;Description automatically generated with medium confidence"/>
+                    <pic:cNvPr id="40279500" name="Picture 1" descr="A diagram of people with text&#10;&#10;Description automatically generated with medium confidence"/>
                     <pic:cNvPicPr/>
                   </pic:nvPicPr>
                   <pic:blipFill>
@@ -10490,7 +10496,7 @@
                   <pic:spPr>
                     <a:xfrm>
                       <a:off x="0" y="0"/>
-                      <a:ext cx="6645910" cy="7286625"/>
+                      <a:ext cx="6014948" cy="6594833"/>
                     </a:xfrm>
                     <a:prstGeom prst="rect">
                       <a:avLst/>
@@ -10830,6 +10836,7 @@
           <w:b/>
           <w:color w:val="00B0F0"/>
         </w:rPr>
+        <w:lastRenderedPageBreak/>
         <w:t>Recommend Artists/Music</w:t>
       </w:r>
       <w:r>
@@ -11639,6 +11646,7 @@
           <w:color w:val="00B0F0"/>
           <w:lang w:val="en-US"/>
         </w:rPr>
+        <w:lastRenderedPageBreak/>
         <w:t>Request to Ban User</w:t>
       </w:r>
       <w:r>
@@ -12806,6 +12814,7 @@
         <w:rPr>
           <w:b/>
         </w:rPr>
+        <w:lastRenderedPageBreak/>
         <w:t>System State on Completion</w:t>
       </w:r>
       <w:r>
@@ -13510,6 +13519,7 @@
           <w:color w:val="0070C0"/>
           <w:lang w:val="en-US"/>
         </w:rPr>
+        <w:lastRenderedPageBreak/>
         <w:t>Normal</w:t>
       </w:r>
       <w:r>
@@ -14273,7 +14283,16 @@
           <w:color w:val="09D2E0"/>
           <w:lang w:val="en-US"/>
         </w:rPr>
-        <w:t>The artist can download the music reports for their records or export them in various formats for further analysis. They may also share the reports with collaborators or stakeholders to demonstrate the success and impact of their music on the platform.</w:t>
+        <w:t xml:space="preserve">The artist can download the music reports for their records or export them in various formats for further analysis. They may </w:t>
+      </w:r>
+      <w:r>
+        <w:rPr>
+          <w:rFonts w:eastAsia="system-ui"/>
+          <w:color w:val="09D2E0"/>
+          <w:lang w:val="en-US"/>
+        </w:rPr>
+        <w:lastRenderedPageBreak/>
+        <w:t>also share the reports with collaborators or stakeholders to demonstrate the success and impact of their music on the platform.</w:t>
       </w:r>
     </w:p>
     <w:p>
@@ -14514,15 +14533,7 @@
         <w:t xml:space="preserve">: </w:t>
       </w:r>
       <w:r>
-        <w:t xml:space="preserve">The admin could ban users from commenting on </w:t>
-      </w:r>
-      <w:proofErr w:type="gramStart"/>
-      <w:r>
-        <w:t>users</w:t>
-      </w:r>
-      <w:proofErr w:type="gramEnd"/>
-      <w:r>
-        <w:t xml:space="preserve"> post.</w:t>
+        <w:t>The admin could ban users from commenting on users post.</w:t>
       </w:r>
     </w:p>
     <w:p>
@@ -15148,6 +15159,7 @@
           <w:b/>
           <w:lang w:val="en-US"/>
         </w:rPr>
+        <w:lastRenderedPageBreak/>
         <w:t>Other Activities</w:t>
       </w:r>
       <w:r>
@@ -15265,6 +15277,7 @@
       </w:pPr>
       <w:bookmarkStart w:id="32" w:name="_Toc156255147"/>
       <w:r>
+        <w:lastRenderedPageBreak/>
         <w:t>Technical Requirements</w:t>
       </w:r>
       <w:bookmarkEnd w:id="32"/>
@@ -15837,6 +15850,7 @@
       </w:pPr>
       <w:bookmarkStart w:id="41" w:name="_Toc156255157"/>
       <w:r>
+        <w:lastRenderedPageBreak/>
         <w:t>Non-Functional Requirements</w:t>
       </w:r>
       <w:bookmarkEnd w:id="41"/>
@@ -16251,6 +16265,7 @@
       </w:pPr>
       <w:bookmarkStart w:id="51" w:name="_Toc156255167"/>
       <w:r>
+        <w:lastRenderedPageBreak/>
         <w:t>Process Requirements</w:t>
       </w:r>
       <w:bookmarkEnd w:id="51"/>
@@ -16540,6 +16555,7 @@
       </w:pPr>
       <w:bookmarkStart w:id="59" w:name="_Toc156255174"/>
       <w:r>
+        <w:lastRenderedPageBreak/>
         <w:t>High-Level Database Schema</w:t>
       </w:r>
       <w:bookmarkEnd w:id="59"/>
@@ -16603,6 +16619,7 @@
       </w:pPr>
       <w:bookmarkStart w:id="60" w:name="_Toc156255175"/>
       <w:r>
+        <w:lastRenderedPageBreak/>
         <w:t>Software Design</w:t>
       </w:r>
       <w:bookmarkEnd w:id="60"/>
@@ -16776,6 +16793,7 @@
       </w:pPr>
       <w:bookmarkStart w:id="63" w:name="_Toc156255178"/>
       <w:r>
+        <w:lastRenderedPageBreak/>
         <w:t xml:space="preserve">State Machine Diagram: </w:t>
       </w:r>
       <w:r>
@@ -16851,6 +16869,7 @@
         </w:numPr>
       </w:pPr>
       <w:r>
+        <w:lastRenderedPageBreak/>
         <w:t xml:space="preserve">State Machine Diagram: </w:t>
       </w:r>
       <w:r>
@@ -16999,6 +17018,7 @@
         <w:rPr>
           <w:noProof/>
         </w:rPr>
+        <w:lastRenderedPageBreak/>
         <w:drawing>
           <wp:inline distT="0" distB="0" distL="0" distR="0" wp14:anchorId="6F76B045" wp14:editId="28020FB7">
             <wp:extent cx="5571959" cy="3893344"/>
@@ -17127,6 +17147,7 @@
       </w:pPr>
       <w:bookmarkStart w:id="65" w:name="_Toc156255180"/>
       <w:r>
+        <w:lastRenderedPageBreak/>
         <w:t>Scenario</w:t>
       </w:r>
       <w:bookmarkEnd w:id="65"/>
@@ -17159,7 +17180,7 @@
 </file>
 
 <file path=word/endnotes.xml><?xml version="1.0" encoding="utf-8"?>
-<w:endnotes xmlns:wpc="http://schemas.microsoft.com/office/word/2010/wordprocessingCanvas" xmlns:cx="http://schemas.microsoft.com/office/drawing/2014/chartex" xmlns:cx1="http://schemas.microsoft.com/office/drawing/2015/9/8/chartex" xmlns:cx2="http://schemas.microsoft.com/office/drawing/2015/10/21/chartex" xmlns:cx3="http://schemas.microsoft.com/office/drawing/2016/5/9/chartex" xmlns:cx4="http://schemas.microsoft.com/office/drawing/2016/5/10/chartex" xmlns:cx5="http://schemas.microsoft.com/office/drawing/2016/5/11/chartex" xmlns:cx6="http://schemas.microsoft.com/office/drawing/2016/5/12/chartex" xmlns:cx7="http://schemas.microsoft.com/office/drawing/2016/5/13/chartex" xmlns:cx8="http://schemas.microsoft.com/office/drawing/2016/5/14/chartex" xmlns:mc="http://schemas.openxmlformats.org/markup-compatibility/2006" xmlns:aink="http://schemas.microsoft.com/office/drawing/2016/ink" xmlns:am3d="http://schemas.microsoft.com/office/drawing/2017/model3d" xmlns:o="urn:schemas-microsoft-com:office:office" xmlns:oel="http://schemas.microsoft.com/office/2019/extlst" xmlns:r="http://schemas.openxmlformats.org/officeDocument/2006/relationships" xmlns:m="http://schemas.openxmlformats.org/officeDocument/2006/math" xmlns:v="urn:schemas-microsoft-com:vml" xmlns:wp14="http://schemas.microsoft.com/office/word/2010/wordprocessingDrawing" xmlns:wp="http://schemas.openxmlformats.org/drawingml/2006/wordprocessingDrawing" xmlns:w10="urn:schemas-microsoft-com:office:word" xmlns:w="http://schemas.openxmlformats.org/wordprocessingml/2006/main" xmlns:w14="http://schemas.microsoft.com/office/word/2010/wordml" xmlns:w15="http://schemas.microsoft.com/office/word/2012/wordml" xmlns:w16cex="http://schemas.microsoft.com/office/word/2018/wordml/cex" xmlns:w16cid="http://schemas.microsoft.com/office/word/2016/wordml/cid" xmlns:w16="http://schemas.microsoft.com/office/word/2018/wordml" xmlns:w16du="http://schemas.microsoft.com/office/word/2023/wordml/word16du" xmlns:w16sdtdh="http://schemas.microsoft.com/office/word/2020/wordml/sdtdatahash" xmlns:w16se="http://schemas.microsoft.com/office/word/2015/wordml/symex" xmlns:wpg="http://schemas.microsoft.com/office/word/2010/wordprocessingGroup" xmlns:wpi="http://schemas.microsoft.com/office/word/2010/wordprocessingInk" xmlns:wne="http://schemas.microsoft.com/office/word/2006/wordml" xmlns:wps="http://schemas.microsoft.com/office/word/2010/wordprocessingShape" mc:Ignorable="w14 w15 w16se w16cid w16 w16cex w16sdtdh w16du wp14">
+<w:endnotes xmlns:wpc="http://schemas.microsoft.com/office/word/2010/wordprocessingCanvas" xmlns:cx="http://schemas.microsoft.com/office/drawing/2014/chartex" xmlns:cx1="http://schemas.microsoft.com/office/drawing/2015/9/8/chartex" xmlns:cx2="http://schemas.microsoft.com/office/drawing/2015/10/21/chartex" xmlns:cx3="http://schemas.microsoft.com/office/drawing/2016/5/9/chartex" xmlns:cx4="http://schemas.microsoft.com/office/drawing/2016/5/10/chartex" xmlns:cx5="http://schemas.microsoft.com/office/drawing/2016/5/11/chartex" xmlns:cx6="http://schemas.microsoft.com/office/drawing/2016/5/12/chartex" xmlns:cx7="http://schemas.microsoft.com/office/drawing/2016/5/13/chartex" xmlns:cx8="http://schemas.microsoft.com/office/drawing/2016/5/14/chartex" xmlns:mc="http://schemas.openxmlformats.org/markup-compatibility/2006" xmlns:aink="http://schemas.microsoft.com/office/drawing/2016/ink" xmlns:am3d="http://schemas.microsoft.com/office/drawing/2017/model3d" xmlns:o="urn:schemas-microsoft-com:office:office" xmlns:oel="http://schemas.microsoft.com/office/2019/extlst" xmlns:r="http://schemas.openxmlformats.org/officeDocument/2006/relationships" xmlns:m="http://schemas.openxmlformats.org/officeDocument/2006/math" xmlns:v="urn:schemas-microsoft-com:vml" xmlns:wp14="http://schemas.microsoft.com/office/word/2010/wordprocessingDrawing" xmlns:wp="http://schemas.openxmlformats.org/drawingml/2006/wordprocessingDrawing" xmlns:w10="urn:schemas-microsoft-com:office:word" xmlns:w="http://schemas.openxmlformats.org/wordprocessingml/2006/main" xmlns:w14="http://schemas.microsoft.com/office/word/2010/wordml" xmlns:w15="http://schemas.microsoft.com/office/word/2012/wordml" xmlns:w16cex="http://schemas.microsoft.com/office/word/2018/wordml/cex" xmlns:w16cid="http://schemas.microsoft.com/office/word/2016/wordml/cid" xmlns:w16="http://schemas.microsoft.com/office/word/2018/wordml" xmlns:w16sdtdh="http://schemas.microsoft.com/office/word/2020/wordml/sdtdatahash" xmlns:w16se="http://schemas.microsoft.com/office/word/2015/wordml/symex" xmlns:wpg="http://schemas.microsoft.com/office/word/2010/wordprocessingGroup" xmlns:wpi="http://schemas.microsoft.com/office/word/2010/wordprocessingInk" xmlns:wne="http://schemas.microsoft.com/office/word/2006/wordml" xmlns:wps="http://schemas.microsoft.com/office/word/2010/wordprocessingShape" mc:Ignorable="w14 w15 w16se w16cid w16 w16cex w16sdtdh wp14">
   <w:endnote w:type="separator" w:id="-1">
     <w:p>
       <w:pPr>
@@ -17191,7 +17212,7 @@
 </file>
 
 <file path=word/footer1.xml><?xml version="1.0" encoding="utf-8"?>
-<w:ftr xmlns:wpc="http://schemas.microsoft.com/office/word/2010/wordprocessingCanvas" xmlns:cx="http://schemas.microsoft.com/office/drawing/2014/chartex" xmlns:cx1="http://schemas.microsoft.com/office/drawing/2015/9/8/chartex" xmlns:cx2="http://schemas.microsoft.com/office/drawing/2015/10/21/chartex" xmlns:cx3="http://schemas.microsoft.com/office/drawing/2016/5/9/chartex" xmlns:cx4="http://schemas.microsoft.com/office/drawing/2016/5/10/chartex" xmlns:cx5="http://schemas.microsoft.com/office/drawing/2016/5/11/chartex" xmlns:cx6="http://schemas.microsoft.com/office/drawing/2016/5/12/chartex" xmlns:cx7="http://schemas.microsoft.com/office/drawing/2016/5/13/chartex" xmlns:cx8="http://schemas.microsoft.com/office/drawing/2016/5/14/chartex" xmlns:mc="http://schemas.openxmlformats.org/markup-compatibility/2006" xmlns:aink="http://schemas.microsoft.com/office/drawing/2016/ink" xmlns:am3d="http://schemas.microsoft.com/office/drawing/2017/model3d" xmlns:o="urn:schemas-microsoft-com:office:office" xmlns:oel="http://schemas.microsoft.com/office/2019/extlst" xmlns:r="http://schemas.openxmlformats.org/officeDocument/2006/relationships" xmlns:m="http://schemas.openxmlformats.org/officeDocument/2006/math" xmlns:v="urn:schemas-microsoft-com:vml" xmlns:wp14="http://schemas.microsoft.com/office/word/2010/wordprocessingDrawing" xmlns:wp="http://schemas.openxmlformats.org/drawingml/2006/wordprocessingDrawing" xmlns:w10="urn:schemas-microsoft-com:office:word" xmlns:w="http://schemas.openxmlformats.org/wordprocessingml/2006/main" xmlns:w14="http://schemas.microsoft.com/office/word/2010/wordml" xmlns:w15="http://schemas.microsoft.com/office/word/2012/wordml" xmlns:w16cex="http://schemas.microsoft.com/office/word/2018/wordml/cex" xmlns:w16cid="http://schemas.microsoft.com/office/word/2016/wordml/cid" xmlns:w16="http://schemas.microsoft.com/office/word/2018/wordml" xmlns:w16du="http://schemas.microsoft.com/office/word/2023/wordml/word16du" xmlns:w16sdtdh="http://schemas.microsoft.com/office/word/2020/wordml/sdtdatahash" xmlns:w16se="http://schemas.microsoft.com/office/word/2015/wordml/symex" xmlns:wpg="http://schemas.microsoft.com/office/word/2010/wordprocessingGroup" xmlns:wpi="http://schemas.microsoft.com/office/word/2010/wordprocessingInk" xmlns:wne="http://schemas.microsoft.com/office/word/2006/wordml" xmlns:wps="http://schemas.microsoft.com/office/word/2010/wordprocessingShape" mc:Ignorable="w14 w15 w16se w16cid w16 w16cex w16sdtdh w16du wp14">
+<w:ftr xmlns:wpc="http://schemas.microsoft.com/office/word/2010/wordprocessingCanvas" xmlns:cx="http://schemas.microsoft.com/office/drawing/2014/chartex" xmlns:cx1="http://schemas.microsoft.com/office/drawing/2015/9/8/chartex" xmlns:cx2="http://schemas.microsoft.com/office/drawing/2015/10/21/chartex" xmlns:cx3="http://schemas.microsoft.com/office/drawing/2016/5/9/chartex" xmlns:cx4="http://schemas.microsoft.com/office/drawing/2016/5/10/chartex" xmlns:cx5="http://schemas.microsoft.com/office/drawing/2016/5/11/chartex" xmlns:cx6="http://schemas.microsoft.com/office/drawing/2016/5/12/chartex" xmlns:cx7="http://schemas.microsoft.com/office/drawing/2016/5/13/chartex" xmlns:cx8="http://schemas.microsoft.com/office/drawing/2016/5/14/chartex" xmlns:mc="http://schemas.openxmlformats.org/markup-compatibility/2006" xmlns:aink="http://schemas.microsoft.com/office/drawing/2016/ink" xmlns:am3d="http://schemas.microsoft.com/office/drawing/2017/model3d" xmlns:o="urn:schemas-microsoft-com:office:office" xmlns:oel="http://schemas.microsoft.com/office/2019/extlst" xmlns:r="http://schemas.openxmlformats.org/officeDocument/2006/relationships" xmlns:m="http://schemas.openxmlformats.org/officeDocument/2006/math" xmlns:v="urn:schemas-microsoft-com:vml" xmlns:wp14="http://schemas.microsoft.com/office/word/2010/wordprocessingDrawing" xmlns:wp="http://schemas.openxmlformats.org/drawingml/2006/wordprocessingDrawing" xmlns:w10="urn:schemas-microsoft-com:office:word" xmlns:w="http://schemas.openxmlformats.org/wordprocessingml/2006/main" xmlns:w14="http://schemas.microsoft.com/office/word/2010/wordml" xmlns:w15="http://schemas.microsoft.com/office/word/2012/wordml" xmlns:w16cex="http://schemas.microsoft.com/office/word/2018/wordml/cex" xmlns:w16cid="http://schemas.microsoft.com/office/word/2016/wordml/cid" xmlns:w16="http://schemas.microsoft.com/office/word/2018/wordml" xmlns:w16sdtdh="http://schemas.microsoft.com/office/word/2020/wordml/sdtdatahash" xmlns:w16se="http://schemas.microsoft.com/office/word/2015/wordml/symex" xmlns:wpg="http://schemas.microsoft.com/office/word/2010/wordprocessingGroup" xmlns:wpi="http://schemas.microsoft.com/office/word/2010/wordprocessingInk" xmlns:wne="http://schemas.microsoft.com/office/word/2006/wordml" xmlns:wps="http://schemas.microsoft.com/office/word/2010/wordprocessingShape" mc:Ignorable="w14 w15 w16se w16cid w16 w16cex w16sdtdh wp14">
   <w:p>
     <w:pPr>
       <w:jc w:val="right"/>
@@ -17219,13 +17240,13 @@
 </file>
 
 <file path=word/footer2.xml><?xml version="1.0" encoding="utf-8"?>
-<w:ftr xmlns:wpc="http://schemas.microsoft.com/office/word/2010/wordprocessingCanvas" xmlns:cx="http://schemas.microsoft.com/office/drawing/2014/chartex" xmlns:cx1="http://schemas.microsoft.com/office/drawing/2015/9/8/chartex" xmlns:cx2="http://schemas.microsoft.com/office/drawing/2015/10/21/chartex" xmlns:cx3="http://schemas.microsoft.com/office/drawing/2016/5/9/chartex" xmlns:cx4="http://schemas.microsoft.com/office/drawing/2016/5/10/chartex" xmlns:cx5="http://schemas.microsoft.com/office/drawing/2016/5/11/chartex" xmlns:cx6="http://schemas.microsoft.com/office/drawing/2016/5/12/chartex" xmlns:cx7="http://schemas.microsoft.com/office/drawing/2016/5/13/chartex" xmlns:cx8="http://schemas.microsoft.com/office/drawing/2016/5/14/chartex" xmlns:mc="http://schemas.openxmlformats.org/markup-compatibility/2006" xmlns:aink="http://schemas.microsoft.com/office/drawing/2016/ink" xmlns:am3d="http://schemas.microsoft.com/office/drawing/2017/model3d" xmlns:o="urn:schemas-microsoft-com:office:office" xmlns:oel="http://schemas.microsoft.com/office/2019/extlst" xmlns:r="http://schemas.openxmlformats.org/officeDocument/2006/relationships" xmlns:m="http://schemas.openxmlformats.org/officeDocument/2006/math" xmlns:v="urn:schemas-microsoft-com:vml" xmlns:wp14="http://schemas.microsoft.com/office/word/2010/wordprocessingDrawing" xmlns:wp="http://schemas.openxmlformats.org/drawingml/2006/wordprocessingDrawing" xmlns:w10="urn:schemas-microsoft-com:office:word" xmlns:w="http://schemas.openxmlformats.org/wordprocessingml/2006/main" xmlns:w14="http://schemas.microsoft.com/office/word/2010/wordml" xmlns:w15="http://schemas.microsoft.com/office/word/2012/wordml" xmlns:w16cex="http://schemas.microsoft.com/office/word/2018/wordml/cex" xmlns:w16cid="http://schemas.microsoft.com/office/word/2016/wordml/cid" xmlns:w16="http://schemas.microsoft.com/office/word/2018/wordml" xmlns:w16du="http://schemas.microsoft.com/office/word/2023/wordml/word16du" xmlns:w16sdtdh="http://schemas.microsoft.com/office/word/2020/wordml/sdtdatahash" xmlns:w16se="http://schemas.microsoft.com/office/word/2015/wordml/symex" xmlns:wpg="http://schemas.microsoft.com/office/word/2010/wordprocessingGroup" xmlns:wpi="http://schemas.microsoft.com/office/word/2010/wordprocessingInk" xmlns:wne="http://schemas.microsoft.com/office/word/2006/wordml" xmlns:wps="http://schemas.microsoft.com/office/word/2010/wordprocessingShape" mc:Ignorable="w14 w15 w16se w16cid w16 w16cex w16sdtdh w16du wp14">
+<w:ftr xmlns:wpc="http://schemas.microsoft.com/office/word/2010/wordprocessingCanvas" xmlns:cx="http://schemas.microsoft.com/office/drawing/2014/chartex" xmlns:cx1="http://schemas.microsoft.com/office/drawing/2015/9/8/chartex" xmlns:cx2="http://schemas.microsoft.com/office/drawing/2015/10/21/chartex" xmlns:cx3="http://schemas.microsoft.com/office/drawing/2016/5/9/chartex" xmlns:cx4="http://schemas.microsoft.com/office/drawing/2016/5/10/chartex" xmlns:cx5="http://schemas.microsoft.com/office/drawing/2016/5/11/chartex" xmlns:cx6="http://schemas.microsoft.com/office/drawing/2016/5/12/chartex" xmlns:cx7="http://schemas.microsoft.com/office/drawing/2016/5/13/chartex" xmlns:cx8="http://schemas.microsoft.com/office/drawing/2016/5/14/chartex" xmlns:mc="http://schemas.openxmlformats.org/markup-compatibility/2006" xmlns:aink="http://schemas.microsoft.com/office/drawing/2016/ink" xmlns:am3d="http://schemas.microsoft.com/office/drawing/2017/model3d" xmlns:o="urn:schemas-microsoft-com:office:office" xmlns:oel="http://schemas.microsoft.com/office/2019/extlst" xmlns:r="http://schemas.openxmlformats.org/officeDocument/2006/relationships" xmlns:m="http://schemas.openxmlformats.org/officeDocument/2006/math" xmlns:v="urn:schemas-microsoft-com:vml" xmlns:wp14="http://schemas.microsoft.com/office/word/2010/wordprocessingDrawing" xmlns:wp="http://schemas.openxmlformats.org/drawingml/2006/wordprocessingDrawing" xmlns:w10="urn:schemas-microsoft-com:office:word" xmlns:w="http://schemas.openxmlformats.org/wordprocessingml/2006/main" xmlns:w14="http://schemas.microsoft.com/office/word/2010/wordml" xmlns:w15="http://schemas.microsoft.com/office/word/2012/wordml" xmlns:w16cex="http://schemas.microsoft.com/office/word/2018/wordml/cex" xmlns:w16cid="http://schemas.microsoft.com/office/word/2016/wordml/cid" xmlns:w16="http://schemas.microsoft.com/office/word/2018/wordml" xmlns:w16sdtdh="http://schemas.microsoft.com/office/word/2020/wordml/sdtdatahash" xmlns:w16se="http://schemas.microsoft.com/office/word/2015/wordml/symex" xmlns:wpg="http://schemas.microsoft.com/office/word/2010/wordprocessingGroup" xmlns:wpi="http://schemas.microsoft.com/office/word/2010/wordprocessingInk" xmlns:wne="http://schemas.microsoft.com/office/word/2006/wordml" xmlns:wps="http://schemas.microsoft.com/office/word/2010/wordprocessingShape" mc:Ignorable="w14 w15 w16se w16cid w16 w16cex w16sdtdh wp14">
   <w:p/>
 </w:ftr>
 </file>
 
 <file path=word/footnotes.xml><?xml version="1.0" encoding="utf-8"?>
-<w:footnotes xmlns:wpc="http://schemas.microsoft.com/office/word/2010/wordprocessingCanvas" xmlns:cx="http://schemas.microsoft.com/office/drawing/2014/chartex" xmlns:cx1="http://schemas.microsoft.com/office/drawing/2015/9/8/chartex" xmlns:cx2="http://schemas.microsoft.com/office/drawing/2015/10/21/chartex" xmlns:cx3="http://schemas.microsoft.com/office/drawing/2016/5/9/chartex" xmlns:cx4="http://schemas.microsoft.com/office/drawing/2016/5/10/chartex" xmlns:cx5="http://schemas.microsoft.com/office/drawing/2016/5/11/chartex" xmlns:cx6="http://schemas.microsoft.com/office/drawing/2016/5/12/chartex" xmlns:cx7="http://schemas.microsoft.com/office/drawing/2016/5/13/chartex" xmlns:cx8="http://schemas.microsoft.com/office/drawing/2016/5/14/chartex" xmlns:mc="http://schemas.openxmlformats.org/markup-compatibility/2006" xmlns:aink="http://schemas.microsoft.com/office/drawing/2016/ink" xmlns:am3d="http://schemas.microsoft.com/office/drawing/2017/model3d" xmlns:o="urn:schemas-microsoft-com:office:office" xmlns:oel="http://schemas.microsoft.com/office/2019/extlst" xmlns:r="http://schemas.openxmlformats.org/officeDocument/2006/relationships" xmlns:m="http://schemas.openxmlformats.org/officeDocument/2006/math" xmlns:v="urn:schemas-microsoft-com:vml" xmlns:wp14="http://schemas.microsoft.com/office/word/2010/wordprocessingDrawing" xmlns:wp="http://schemas.openxmlformats.org/drawingml/2006/wordprocessingDrawing" xmlns:w10="urn:schemas-microsoft-com:office:word" xmlns:w="http://schemas.openxmlformats.org/wordprocessingml/2006/main" xmlns:w14="http://schemas.microsoft.com/office/word/2010/wordml" xmlns:w15="http://schemas.microsoft.com/office/word/2012/wordml" xmlns:w16cex="http://schemas.microsoft.com/office/word/2018/wordml/cex" xmlns:w16cid="http://schemas.microsoft.com/office/word/2016/wordml/cid" xmlns:w16="http://schemas.microsoft.com/office/word/2018/wordml" xmlns:w16du="http://schemas.microsoft.com/office/word/2023/wordml/word16du" xmlns:w16sdtdh="http://schemas.microsoft.com/office/word/2020/wordml/sdtdatahash" xmlns:w16se="http://schemas.microsoft.com/office/word/2015/wordml/symex" xmlns:wpg="http://schemas.microsoft.com/office/word/2010/wordprocessingGroup" xmlns:wpi="http://schemas.microsoft.com/office/word/2010/wordprocessingInk" xmlns:wne="http://schemas.microsoft.com/office/word/2006/wordml" xmlns:wps="http://schemas.microsoft.com/office/word/2010/wordprocessingShape" mc:Ignorable="w14 w15 w16se w16cid w16 w16cex w16sdtdh w16du wp14">
+<w:footnotes xmlns:wpc="http://schemas.microsoft.com/office/word/2010/wordprocessingCanvas" xmlns:cx="http://schemas.microsoft.com/office/drawing/2014/chartex" xmlns:cx1="http://schemas.microsoft.com/office/drawing/2015/9/8/chartex" xmlns:cx2="http://schemas.microsoft.com/office/drawing/2015/10/21/chartex" xmlns:cx3="http://schemas.microsoft.com/office/drawing/2016/5/9/chartex" xmlns:cx4="http://schemas.microsoft.com/office/drawing/2016/5/10/chartex" xmlns:cx5="http://schemas.microsoft.com/office/drawing/2016/5/11/chartex" xmlns:cx6="http://schemas.microsoft.com/office/drawing/2016/5/12/chartex" xmlns:cx7="http://schemas.microsoft.com/office/drawing/2016/5/13/chartex" xmlns:cx8="http://schemas.microsoft.com/office/drawing/2016/5/14/chartex" xmlns:mc="http://schemas.openxmlformats.org/markup-compatibility/2006" xmlns:aink="http://schemas.microsoft.com/office/drawing/2016/ink" xmlns:am3d="http://schemas.microsoft.com/office/drawing/2017/model3d" xmlns:o="urn:schemas-microsoft-com:office:office" xmlns:oel="http://schemas.microsoft.com/office/2019/extlst" xmlns:r="http://schemas.openxmlformats.org/officeDocument/2006/relationships" xmlns:m="http://schemas.openxmlformats.org/officeDocument/2006/math" xmlns:v="urn:schemas-microsoft-com:vml" xmlns:wp14="http://schemas.microsoft.com/office/word/2010/wordprocessingDrawing" xmlns:wp="http://schemas.openxmlformats.org/drawingml/2006/wordprocessingDrawing" xmlns:w10="urn:schemas-microsoft-com:office:word" xmlns:w="http://schemas.openxmlformats.org/wordprocessingml/2006/main" xmlns:w14="http://schemas.microsoft.com/office/word/2010/wordml" xmlns:w15="http://schemas.microsoft.com/office/word/2012/wordml" xmlns:w16cex="http://schemas.microsoft.com/office/word/2018/wordml/cex" xmlns:w16cid="http://schemas.microsoft.com/office/word/2016/wordml/cid" xmlns:w16="http://schemas.microsoft.com/office/word/2018/wordml" xmlns:w16sdtdh="http://schemas.microsoft.com/office/word/2020/wordml/sdtdatahash" xmlns:w16se="http://schemas.microsoft.com/office/word/2015/wordml/symex" xmlns:wpg="http://schemas.microsoft.com/office/word/2010/wordprocessingGroup" xmlns:wpi="http://schemas.microsoft.com/office/word/2010/wordprocessingInk" xmlns:wne="http://schemas.microsoft.com/office/word/2006/wordml" xmlns:wps="http://schemas.microsoft.com/office/word/2010/wordprocessingShape" mc:Ignorable="w14 w15 w16se w16cid w16 w16cex w16sdtdh wp14">
   <w:footnote w:type="separator" w:id="-1">
     <w:p>
       <w:pPr>
@@ -17257,7 +17278,7 @@
 </file>
 
 <file path=word/numbering.xml><?xml version="1.0" encoding="utf-8"?>
-<w:numbering xmlns:wpc="http://schemas.microsoft.com/office/word/2010/wordprocessingCanvas" xmlns:cx="http://schemas.microsoft.com/office/drawing/2014/chartex" xmlns:cx1="http://schemas.microsoft.com/office/drawing/2015/9/8/chartex" xmlns:cx2="http://schemas.microsoft.com/office/drawing/2015/10/21/chartex" xmlns:cx3="http://schemas.microsoft.com/office/drawing/2016/5/9/chartex" xmlns:cx4="http://schemas.microsoft.com/office/drawing/2016/5/10/chartex" xmlns:cx5="http://schemas.microsoft.com/office/drawing/2016/5/11/chartex" xmlns:cx6="http://schemas.microsoft.com/office/drawing/2016/5/12/chartex" xmlns:cx7="http://schemas.microsoft.com/office/drawing/2016/5/13/chartex" xmlns:cx8="http://schemas.microsoft.com/office/drawing/2016/5/14/chartex" xmlns:mc="http://schemas.openxmlformats.org/markup-compatibility/2006" xmlns:aink="http://schemas.microsoft.com/office/drawing/2016/ink" xmlns:am3d="http://schemas.microsoft.com/office/drawing/2017/model3d" xmlns:o="urn:schemas-microsoft-com:office:office" xmlns:oel="http://schemas.microsoft.com/office/2019/extlst" xmlns:r="http://schemas.openxmlformats.org/officeDocument/2006/relationships" xmlns:m="http://schemas.openxmlformats.org/officeDocument/2006/math" xmlns:v="urn:schemas-microsoft-com:vml" xmlns:wp14="http://schemas.microsoft.com/office/word/2010/wordprocessingDrawing" xmlns:wp="http://schemas.openxmlformats.org/drawingml/2006/wordprocessingDrawing" xmlns:w10="urn:schemas-microsoft-com:office:word" xmlns:w="http://schemas.openxmlformats.org/wordprocessingml/2006/main" xmlns:w14="http://schemas.microsoft.com/office/word/2010/wordml" xmlns:w15="http://schemas.microsoft.com/office/word/2012/wordml" xmlns:w16cex="http://schemas.microsoft.com/office/word/2018/wordml/cex" xmlns:w16cid="http://schemas.microsoft.com/office/word/2016/wordml/cid" xmlns:w16="http://schemas.microsoft.com/office/word/2018/wordml" xmlns:w16du="http://schemas.microsoft.com/office/word/2023/wordml/word16du" xmlns:w16sdtdh="http://schemas.microsoft.com/office/word/2020/wordml/sdtdatahash" xmlns:w16se="http://schemas.microsoft.com/office/word/2015/wordml/symex" xmlns:wpg="http://schemas.microsoft.com/office/word/2010/wordprocessingGroup" xmlns:wpi="http://schemas.microsoft.com/office/word/2010/wordprocessingInk" xmlns:wne="http://schemas.microsoft.com/office/word/2006/wordml" xmlns:wps="http://schemas.microsoft.com/office/word/2010/wordprocessingShape" mc:Ignorable="w14 w15 w16se w16cid w16 w16cex w16sdtdh w16du wp14">
+<w:numbering xmlns:wpc="http://schemas.microsoft.com/office/word/2010/wordprocessingCanvas" xmlns:cx="http://schemas.microsoft.com/office/drawing/2014/chartex" xmlns:cx1="http://schemas.microsoft.com/office/drawing/2015/9/8/chartex" xmlns:cx2="http://schemas.microsoft.com/office/drawing/2015/10/21/chartex" xmlns:cx3="http://schemas.microsoft.com/office/drawing/2016/5/9/chartex" xmlns:cx4="http://schemas.microsoft.com/office/drawing/2016/5/10/chartex" xmlns:cx5="http://schemas.microsoft.com/office/drawing/2016/5/11/chartex" xmlns:cx6="http://schemas.microsoft.com/office/drawing/2016/5/12/chartex" xmlns:cx7="http://schemas.microsoft.com/office/drawing/2016/5/13/chartex" xmlns:cx8="http://schemas.microsoft.com/office/drawing/2016/5/14/chartex" xmlns:mc="http://schemas.openxmlformats.org/markup-compatibility/2006" xmlns:aink="http://schemas.microsoft.com/office/drawing/2016/ink" xmlns:am3d="http://schemas.microsoft.com/office/drawing/2017/model3d" xmlns:o="urn:schemas-microsoft-com:office:office" xmlns:oel="http://schemas.microsoft.com/office/2019/extlst" xmlns:r="http://schemas.openxmlformats.org/officeDocument/2006/relationships" xmlns:m="http://schemas.openxmlformats.org/officeDocument/2006/math" xmlns:v="urn:schemas-microsoft-com:vml" xmlns:wp14="http://schemas.microsoft.com/office/word/2010/wordprocessingDrawing" xmlns:wp="http://schemas.openxmlformats.org/drawingml/2006/wordprocessingDrawing" xmlns:w10="urn:schemas-microsoft-com:office:word" xmlns:w="http://schemas.openxmlformats.org/wordprocessingml/2006/main" xmlns:w14="http://schemas.microsoft.com/office/word/2010/wordml" xmlns:w15="http://schemas.microsoft.com/office/word/2012/wordml" xmlns:w16cex="http://schemas.microsoft.com/office/word/2018/wordml/cex" xmlns:w16cid="http://schemas.microsoft.com/office/word/2016/wordml/cid" xmlns:w16="http://schemas.microsoft.com/office/word/2018/wordml" xmlns:w16sdtdh="http://schemas.microsoft.com/office/word/2020/wordml/sdtdatahash" xmlns:w16se="http://schemas.microsoft.com/office/word/2015/wordml/symex" xmlns:wpg="http://schemas.microsoft.com/office/word/2010/wordprocessingGroup" xmlns:wpi="http://schemas.microsoft.com/office/word/2010/wordprocessingInk" xmlns:wne="http://schemas.microsoft.com/office/word/2006/wordml" xmlns:wps="http://schemas.microsoft.com/office/word/2010/wordprocessingShape" mc:Ignorable="w14 w15 w16se w16cid w16 w16cex w16sdtdh wp14">
   <w:abstractNum w:abstractNumId="0" w15:restartNumberingAfterBreak="0">
     <w:nsid w:val="00FD2661"/>
     <w:multiLevelType w:val="multilevel"/>
@@ -22436,7 +22457,7 @@
 </file>
 
 <file path=word/styles.xml><?xml version="1.0" encoding="utf-8"?>
-<w:styles xmlns:mc="http://schemas.openxmlformats.org/markup-compatibility/2006" xmlns:r="http://schemas.openxmlformats.org/officeDocument/2006/relationships" xmlns:w="http://schemas.openxmlformats.org/wordprocessingml/2006/main" xmlns:w14="http://schemas.microsoft.com/office/word/2010/wordml" xmlns:w15="http://schemas.microsoft.com/office/word/2012/wordml" xmlns:w16cex="http://schemas.microsoft.com/office/word/2018/wordml/cex" xmlns:w16cid="http://schemas.microsoft.com/office/word/2016/wordml/cid" xmlns:w16="http://schemas.microsoft.com/office/word/2018/wordml" xmlns:w16du="http://schemas.microsoft.com/office/word/2023/wordml/word16du" xmlns:w16sdtdh="http://schemas.microsoft.com/office/word/2020/wordml/sdtdatahash" xmlns:w16se="http://schemas.microsoft.com/office/word/2015/wordml/symex" mc:Ignorable="w14 w15 w16se w16cid w16 w16cex w16sdtdh w16du">
+<w:styles xmlns:mc="http://schemas.openxmlformats.org/markup-compatibility/2006" xmlns:r="http://schemas.openxmlformats.org/officeDocument/2006/relationships" xmlns:w="http://schemas.openxmlformats.org/wordprocessingml/2006/main" xmlns:w14="http://schemas.microsoft.com/office/word/2010/wordml" xmlns:w15="http://schemas.microsoft.com/office/word/2012/wordml" xmlns:w16cex="http://schemas.microsoft.com/office/word/2018/wordml/cex" xmlns:w16cid="http://schemas.microsoft.com/office/word/2016/wordml/cid" xmlns:w16="http://schemas.microsoft.com/office/word/2018/wordml" xmlns:w16sdtdh="http://schemas.microsoft.com/office/word/2020/wordml/sdtdatahash" xmlns:w16se="http://schemas.microsoft.com/office/word/2015/wordml/symex" mc:Ignorable="w14 w15 w16se w16cid w16 w16cex w16sdtdh">
   <w:docDefaults>
     <w:rPrDefault>
       <w:rPr>
@@ -22958,6 +22979,8 @@
   <w:style w:type="table" w:default="1" w:styleId="TableNormal">
     <w:name w:val="Normal Table"/>
     <w:uiPriority w:val="99"/>
+    <w:semiHidden/>
+    <w:unhideWhenUsed/>
     <w:tblPr>
       <w:tblInd w:w="0" w:type="dxa"/>
       <w:tblCellMar>
@@ -23670,28 +23693,28 @@
 </file>
 
 <file path=customXml/item1.xml><?xml version="1.0" encoding="utf-8"?>
+<b:Sources xmlns:b="http://schemas.openxmlformats.org/officeDocument/2006/bibliography" xmlns="http://schemas.openxmlformats.org/officeDocument/2006/bibliography" SelectedStyle="\APASixthEditionOfficeOnline.xsl" StyleName="APA" Version="6"/>
+</file>
+
+<file path=customXml/item2.xml><?xml version="1.0" encoding="utf-8"?>
 <go:gDocsCustomXmlDataStorage xmlns:go="http://customooxmlschemas.google.com/" xmlns:r="http://schemas.openxmlformats.org/officeDocument/2006/relationships">
   <go:docsCustomData xmlns:go="http://customooxmlschemas.google.com/" roundtripDataSignature="AMtx7miMsjpHgLkCpnb+eyO7PhWylfuRdA==">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</go:docsCustomData>
 </go:gDocsCustomXmlDataStorage>
 </file>
 
-<file path=customXml/item2.xml><?xml version="1.0" encoding="utf-8"?>
-<b:Sources xmlns:b="http://schemas.openxmlformats.org/officeDocument/2006/bibliography" xmlns="http://schemas.openxmlformats.org/officeDocument/2006/bibliography" SelectedStyle="\APASixthEditionOfficeOnline.xsl" StyleName="APA" Version="6"/>
-</file>
-
 <file path=customXml/itemProps1.xml><?xml version="1.0" encoding="utf-8"?>
-<ds:datastoreItem xmlns:ds="http://schemas.openxmlformats.org/officeDocument/2006/customXml" ds:itemID="{11111111-1234-1234-1234-123412341234}">
+<ds:datastoreItem xmlns:ds="http://schemas.openxmlformats.org/officeDocument/2006/customXml" ds:itemID="{B1036428-7A71-4B07-BCB8-9BAC1352BF4E}">
   <ds:schemaRefs>
-    <ds:schemaRef ds:uri="http://customooxmlschemas.google.com/"/>
-    <ds:schemaRef ds:uri="http://schemas.openxmlformats.org/officeDocument/2006/relationships"/>
+    <ds:schemaRef ds:uri="http://schemas.openxmlformats.org/officeDocument/2006/bibliography"/>
   </ds:schemaRefs>
 </ds:datastoreItem>
 </file>
 
 <file path=customXml/itemProps2.xml><?xml version="1.0" encoding="utf-8"?>
-<ds:datastoreItem xmlns:ds="http://schemas.openxmlformats.org/officeDocument/2006/customXml" ds:itemID="{B1036428-7A71-4B07-BCB8-9BAC1352BF4E}">
+<ds:datastoreItem xmlns:ds="http://schemas.openxmlformats.org/officeDocument/2006/customXml" ds:itemID="{11111111-1234-1234-1234-123412341234}">
   <ds:schemaRefs>
-    <ds:schemaRef ds:uri="http://schemas.openxmlformats.org/officeDocument/2006/bibliography"/>
+    <ds:schemaRef ds:uri="http://customooxmlschemas.google.com/"/>
+    <ds:schemaRef ds:uri="http://schemas.openxmlformats.org/officeDocument/2006/relationships"/>
   </ds:schemaRefs>
 </ds:datastoreItem>
 </file>

</xml_diff>